<commit_message>
v14: enlarge Fig.5 by 30%, expand §4.4 discussion to contrast Baseline's limited reflection removal against SGA
</commit_message>
<xml_diff>
--- a/paper/cvgip2025_SGA_chinese_v14.docx
+++ b/paper/cvgip2025_SGA_chinese_v14.docx
@@ -6263,7 +6263,7 @@
           <w:sz w:val="20"/>
           <w:lang w:eastAsia="zh-TW"/>
         </w:rPr>
-        <w:t>圖 5 為博物館藏品在 Pix2Pix+SGA 處理前後的視覺比較。反光區明顯減弱，提供了與「Sobel 先驗使邊緣感知注意力遷移至博物館場景」這一論點相符的直觀證據。</w:t>
+        <w:t>圖 5 比較博物館藏品在三種條件下的結果：原始含反光影像、Baseline Pix2Pix，以及 Pix2Pix+SGA。Baseline 雖然同樣嘗試抑制反光，但效果有限，仍可見明顯殘留反光，且整體解析度與細節亦有明顯下降。相較之下，加入 SGA 後反光區明顯減弱，物件結構也保留得更完整。這提供了與「Sobel 先驗使邊緣感知注意力遷移至博物館場景」這一論點相符的直觀證據。</w:t>
       </w:r>
     </w:p>
     <w:p>
@@ -6331,7 +6331,7 @@
             <wp:positionV relativeFrom="paragraph">
               <wp:posOffset>2540</wp:posOffset>
             </wp:positionV>
-            <wp:extent cx="3950970" cy="1508913"/>
+            <wp:extent cx="5136261" cy="1961587"/>
             <wp:effectExtent l="0" t="0" r="0" b="5715"/>
             <wp:wrapTopAndBottom/>
             <wp:docPr id="12" name="Picture 12"/>
@@ -6354,7 +6354,7 @@
                   <pic:spPr>
                     <a:xfrm>
                       <a:off x="0" y="0"/>
-                      <a:ext cx="3950970" cy="1508913"/>
+                      <a:ext cx="5136261" cy="1961587"/>
                     </a:xfrm>
                     <a:prstGeom prst="rect">
                       <a:avLst/>

</xml_diff>